<commit_message>
Make the LSTM a main candidate in 3.2.3 and 3.2.4
Co-Authored-By: Claude Opus 5.5 <noreply@anthropic.com>
Claude-Session: https://claude.ai/code/session_01KrVvuWxDmBDGvHTuGVMuit
</commit_message>
<xml_diff>
--- a/literature-review/Section_3.2.3_Deep_Learning_Approaches.docx
+++ b/literature-review/Section_3.2.3_Deep_Learning_Approaches.docx
@@ -1641,7 +1641,7 @@
           <w:sz w:val="22"/>
           <w:szCs w:val="22"/>
         </w:rPr>
-        <w:t xml:space="preserve">For this project, two deep-learning models match the data the HFCT system is expected to produce: a compact </w:t>
+        <w:t xml:space="preserve">For this project, three deep-learning candidates match the data the HFCT system is expected to produce: a compact </w:t>
       </w:r>
       <w:r>
         <w:rPr>
@@ -1659,7 +1659,7 @@
           <w:sz w:val="22"/>
           <w:szCs w:val="22"/>
         </w:rPr>
-        <w:t xml:space="preserve">, following [6], and a compact </w:t>
+        <w:t xml:space="preserve">, following [6]; a compact </w:t>
       </w:r>
       <w:r>
         <w:rPr>
@@ -1677,7 +1677,25 @@
           <w:sz w:val="22"/>
           <w:szCs w:val="22"/>
         </w:rPr>
-        <w:t xml:space="preserve">, following [5], if a phase reference is available. An LSTM will be considered only if the order of the measured cycles is shown to add information, and one pretrained or Transformer model may be tested as an extension rather than as the starting point. All DL models will be compared with the SVM and random-forest baselines of Section 3.2.2 on the same data and split (Section 3.2.4).</w:t>
+        <w:t xml:space="preserve">, following [5], if a phase reference is available; and an </w:t>
+      </w:r>
+      <w:r>
+        <w:rPr>
+          <w:rFonts w:ascii="Calibri" w:cs="Calibri" w:eastAsia="Calibri" w:hAnsi="Calibri"/>
+          <w:b/>
+          <w:bCs/>
+          <w:sz w:val="22"/>
+          <w:szCs w:val="22"/>
+        </w:rPr>
+        <w:t xml:space="preserve">LSTM on sequences of PD cycles</w:t>
+      </w:r>
+      <w:r>
+        <w:rPr>
+          <w:rFonts w:ascii="Calibri" w:cs="Calibri" w:eastAsia="Calibri" w:hAnsi="Calibri"/>
+          <w:sz w:val="22"/>
+          <w:szCs w:val="22"/>
+        </w:rPr>
+        <w:t xml:space="preserve">, following [11]. The LSTM is of particular interest because it models how PD activity changes over time, which also links classification to the project’s failure-prediction objective (Section 3.2.5.4). One pretrained or Transformer model may be tested as an extension rather than as the starting point. All DL models will be compared with the SVM and random-forest baselines of Section 3.2.2 on the same data and split (Section 3.2.4).</w:t>
       </w:r>
     </w:p>
     <w:p>
@@ -1744,7 +1762,7 @@
         </w:rPr>
         <w:t xml:space="preserve"> </w:t>
       </w:r>
-      <w:hyperlink w:history="1" r:id="rIducbzcxjh2prjr8brezxf9">
+      <w:hyperlink w:history="1" r:id="rId0tm2nd8hgt_0p_zkzhbn9">
         <w:r>
           <w:rPr>
             <w:rStyle w:val="Hyperlink"/>
@@ -1803,7 +1821,7 @@
         </w:rPr>
         <w:t xml:space="preserve"> </w:t>
       </w:r>
-      <w:hyperlink w:history="1" r:id="rId7u3awshmd__r6ha9fb8vz">
+      <w:hyperlink w:history="1" r:id="rIdhg9pt1izcodpedn9mpuit">
         <w:r>
           <w:rPr>
             <w:rStyle w:val="Hyperlink"/>
@@ -1880,7 +1898,7 @@
         </w:rPr>
         <w:t xml:space="preserve"> </w:t>
       </w:r>
-      <w:hyperlink w:history="1" r:id="rIdfnguxvoblwjiqwxcyqxc4">
+      <w:hyperlink w:history="1" r:id="rId3ldc-pcqws0nby-fmeykt">
         <w:r>
           <w:rPr>
             <w:rStyle w:val="Hyperlink"/>
@@ -1957,7 +1975,7 @@
         </w:rPr>
         <w:t xml:space="preserve"> </w:t>
       </w:r>
-      <w:hyperlink w:history="1" r:id="rIdvfwmc_zgnsxqqm6odocp9">
+      <w:hyperlink w:history="1" r:id="rIdv_4owtledn1odx9dyflkl">
         <w:r>
           <w:rPr>
             <w:rStyle w:val="Hyperlink"/>
@@ -2016,7 +2034,7 @@
         </w:rPr>
         <w:t xml:space="preserve"> </w:t>
       </w:r>
-      <w:hyperlink w:history="1" r:id="rIdgpsuy9nsl_bkol85uyhfr">
+      <w:hyperlink w:history="1" r:id="rId4cq9evoyf9nwbi62kmsqn">
         <w:r>
           <w:rPr>
             <w:rStyle w:val="Hyperlink"/>
@@ -2093,7 +2111,7 @@
         </w:rPr>
         <w:t xml:space="preserve"> </w:t>
       </w:r>
-      <w:hyperlink w:history="1" r:id="rId5yzra9ai5mt99o4vrx4n5">
+      <w:hyperlink w:history="1" r:id="rIdbvqepg6utryazqn7hgfvx">
         <w:r>
           <w:rPr>
             <w:rStyle w:val="Hyperlink"/>

</xml_diff>